<commit_message>
Make it a stand-alone project: remove course, teacher and group details
Header now reads "Orthogonal - IOI" with a one-line description; the
footer box with instructor and scholar names is gone. README,
INSTRUCTIONS, LICENSE and the code walkthrough no longer mention the
course.

Co-Authored-By: Claude Opus 5.5 <noreply@anthropic.com>
Claude-Session: https://claude.ai/code/session_01LTQmmgGuKRtQLWNmRFYdkw
</commit_message>
<xml_diff>
--- a/docs/Code-Walkthrough.docx
+++ b/docs/Code-Walkthrough.docx
@@ -29,7 +29,7 @@
           <w:sz w:val="28"/>
           <w:szCs w:val="28"/>
         </w:rPr>
-        <w:t xml:space="preserve">Code walkthrough for the viva</w:t>
+        <w:t xml:space="preserve">Code walkthrough</w:t>
       </w:r>
     </w:p>
     <w:p>
@@ -42,7 +42,7 @@
           <w:sz w:val="22"/>
           <w:szCs w:val="22"/>
         </w:rPr>
-        <w:t xml:space="preserve">MATH 205 · Group 7 · [Group Name] · From Curves to Solutions: Exploring Differential Equations · Instructor: Pulak Kundu</w:t>
+        <w:t xml:space="preserve">Type a family of curves and see its orthogonal trajectories. Live site: https://ali-ioi.github.io/ORTHOGONAL-IOI/</w:t>
       </w:r>
     </w:p>
     <w:p>
@@ -58,7 +58,7 @@
           <w:sz w:val="20"/>
           <w:szCs w:val="20"/>
         </w:rPr>
-        <w:t xml:space="preserve">Draft 1 — 13 October 2026. Will be polished together with the viva questions.</w:t>
+        <w:t xml:space="preserve">Draft 1 — 13 October 2026.</w:t>
       </w:r>
     </w:p>
     <w:p>
@@ -236,7 +236,7 @@
           <w:sz w:val="22"/>
           <w:szCs w:val="22"/>
         </w:rPr>
-        <w:t xml:space="preserve">A browser runs only JavaScript and WebAssembly. Emscripten compiles our C++ into WebAssembly (ortho.wasm), so the browser runs our C++ code directly. JavaScript is still needed for the page itself, because WebAssembly cannot read an input box or draw on the screen by itself.</w:t>
+        <w:t xml:space="preserve">A browser runs only JavaScript and WebAssembly. Emscripten compiles our C++ into WebAssembly (the WebAssembly code inside index.html), so the browser runs our C++ code directly. JavaScript is still needed for the page itself, because WebAssembly cannot read an input box or draw on the screen by itself.</w:t>
       </w:r>
     </w:p>
     <w:p>
@@ -2574,7 +2574,7 @@
           <w:sz w:val="22"/>
           <w:szCs w:val="22"/>
         </w:rPr>
-        <w:t xml:space="preserve">All results agree with the expected answers in the project brief. y² = k − 2x for y = c eˣ is the same curve family as 2x + y² = k. The small |cos θ| values come from the drawing step size, not from the formulas.</w:t>
+        <w:t xml:space="preserve">All results agree with the standard textbook answers. y² = k − 2x for y = c eˣ is the same curve family as 2x + y² = k. The small |cos θ| values come from the drawing step size, not from the formulas.</w:t>
       </w:r>
     </w:p>
     <w:sectPr>

</xml_diff>